<commit_message>
Add direct site links to metal programs
</commit_message>
<xml_diff>
--- a/subject-program-library/programs/Folding-Camping-Shovel-40-Period-Teaching-Program-v2.1-Network-Benchmark.docx
+++ b/subject-program-library/programs/Folding-Camping-Shovel-40-Period-Teaching-Program-v2.1-Network-Benchmark.docx
@@ -1526,16 +1526,26 @@
             <w:pPr>
               <w:spacing w:after="0" w:before="0"/>
             </w:pPr>
-            <w:r/>
-            <w:r>
-              <w:rPr>
-                <w:rFonts w:ascii="Arial" w:hAnsi="Arial"/>
-                <w:b/>
-                <w:color w:val="25342D"/>
-                <w:sz w:val="19"/>
-              </w:rPr>
-              <w:t>Site/theory</w:t>
-            </w:r>
+            <w:hyperlink r:id="rId13">
+              <w:r>
+                <w:rPr>
+                  <w:rStyle w:val="Hyperlink"/>
+                  <w:color w:val="0563C1"/>
+                  <w:u w:val="single"/>
+                </w:rPr>
+              </w:r>
+              <w:r>
+                <w:rPr>
+                  <w:rStyle w:val="Hyperlink"/>
+                  <w:rFonts w:ascii="Arial" w:hAnsi="Arial"/>
+                  <w:b/>
+                  <w:color w:val="0563C1"/>
+                  <w:sz w:val="19"/>
+                  <w:u w:val="single"/>
+                </w:rPr>
+                <w:t>Site/theory</w:t>
+              </w:r>
+            </w:hyperlink>
           </w:p>
         </w:tc>
         <w:tc>
@@ -1548,16 +1558,26 @@
             <w:pPr>
               <w:spacing w:after="0" w:before="0"/>
             </w:pPr>
-            <w:r/>
-            <w:r>
-              <w:rPr>
-                <w:rFonts w:ascii="Arial" w:hAnsi="Arial"/>
-                <w:b w:val="0"/>
-                <w:color w:val="25342D"/>
-                <w:sz w:val="19"/>
-              </w:rPr>
-              <w:t>Module 1: Brief, modifications and job planning</w:t>
-            </w:r>
+            <w:hyperlink r:id="rId13">
+              <w:r>
+                <w:rPr>
+                  <w:rStyle w:val="Hyperlink"/>
+                  <w:color w:val="0563C1"/>
+                  <w:u w:val="single"/>
+                </w:rPr>
+              </w:r>
+              <w:r>
+                <w:rPr>
+                  <w:rStyle w:val="Hyperlink"/>
+                  <w:rFonts w:ascii="Arial" w:hAnsi="Arial"/>
+                  <w:b w:val="0"/>
+                  <w:color w:val="0563C1"/>
+                  <w:sz w:val="19"/>
+                  <w:u w:val="single"/>
+                </w:rPr>
+                <w:t>Module 1: Brief, modifications and job planning</w:t>
+              </w:r>
+            </w:hyperlink>
           </w:p>
         </w:tc>
         <w:tc>
@@ -1839,16 +1859,26 @@
             <w:pPr>
               <w:spacing w:after="0" w:before="0"/>
             </w:pPr>
-            <w:r/>
-            <w:r>
-              <w:rPr>
-                <w:rFonts w:ascii="Arial" w:hAnsi="Arial"/>
-                <w:b/>
-                <w:color w:val="25342D"/>
-                <w:sz w:val="19"/>
-              </w:rPr>
-              <w:t>Project/folio</w:t>
-            </w:r>
+            <w:hyperlink r:id="rId19">
+              <w:r>
+                <w:rPr>
+                  <w:rStyle w:val="Hyperlink"/>
+                  <w:color w:val="0563C1"/>
+                  <w:u w:val="single"/>
+                </w:rPr>
+              </w:r>
+              <w:r>
+                <w:rPr>
+                  <w:rStyle w:val="Hyperlink"/>
+                  <w:rFonts w:ascii="Arial" w:hAnsi="Arial"/>
+                  <w:b/>
+                  <w:color w:val="0563C1"/>
+                  <w:sz w:val="19"/>
+                  <w:u w:val="single"/>
+                </w:rPr>
+                <w:t>Project/folio</w:t>
+              </w:r>
+            </w:hyperlink>
           </w:p>
         </w:tc>
         <w:tc>
@@ -1861,16 +1891,26 @@
             <w:pPr>
               <w:spacing w:after="0" w:before="0"/>
             </w:pPr>
-            <w:r/>
-            <w:r>
-              <w:rPr>
-                <w:rFonts w:ascii="Arial" w:hAnsi="Arial"/>
-                <w:b w:val="0"/>
-                <w:color w:val="25342D"/>
-                <w:sz w:val="19"/>
-              </w:rPr>
-              <w:t>Module 1: folio and project decisions</w:t>
-            </w:r>
+            <w:hyperlink r:id="rId19">
+              <w:r>
+                <w:rPr>
+                  <w:rStyle w:val="Hyperlink"/>
+                  <w:color w:val="0563C1"/>
+                  <w:u w:val="single"/>
+                </w:rPr>
+              </w:r>
+              <w:r>
+                <w:rPr>
+                  <w:rStyle w:val="Hyperlink"/>
+                  <w:rFonts w:ascii="Arial" w:hAnsi="Arial"/>
+                  <w:b w:val="0"/>
+                  <w:color w:val="0563C1"/>
+                  <w:sz w:val="19"/>
+                  <w:u w:val="single"/>
+                </w:rPr>
+                <w:t>Module 1: folio and project decisions</w:t>
+              </w:r>
+            </w:hyperlink>
           </w:p>
         </w:tc>
         <w:tc>
@@ -2867,16 +2907,26 @@
             <w:pPr>
               <w:spacing w:after="0" w:before="0"/>
             </w:pPr>
-            <w:r/>
-            <w:r>
-              <w:rPr>
-                <w:rFonts w:ascii="Arial" w:hAnsi="Arial"/>
-                <w:b/>
-                <w:color w:val="25342D"/>
-                <w:sz w:val="19"/>
-              </w:rPr>
-              <w:t>Site/theory</w:t>
-            </w:r>
+            <w:hyperlink r:id="rId21">
+              <w:r>
+                <w:rPr>
+                  <w:rStyle w:val="Hyperlink"/>
+                  <w:color w:val="0563C1"/>
+                  <w:u w:val="single"/>
+                </w:rPr>
+              </w:r>
+              <w:r>
+                <w:rPr>
+                  <w:rStyle w:val="Hyperlink"/>
+                  <w:rFonts w:ascii="Arial" w:hAnsi="Arial"/>
+                  <w:b/>
+                  <w:color w:val="0563C1"/>
+                  <w:sz w:val="19"/>
+                  <w:u w:val="single"/>
+                </w:rPr>
+                <w:t>Site/theory</w:t>
+              </w:r>
+            </w:hyperlink>
           </w:p>
         </w:tc>
         <w:tc>
@@ -2889,16 +2939,26 @@
             <w:pPr>
               <w:spacing w:after="0" w:before="0"/>
             </w:pPr>
-            <w:r/>
-            <w:r>
-              <w:rPr>
-                <w:rFonts w:ascii="Arial" w:hAnsi="Arial"/>
-                <w:b w:val="0"/>
-                <w:color w:val="25342D"/>
-                <w:sz w:val="19"/>
-              </w:rPr>
-              <w:t>Module 1: Brief, modifications and job planning</w:t>
-            </w:r>
+            <w:hyperlink r:id="rId21">
+              <w:r>
+                <w:rPr>
+                  <w:rStyle w:val="Hyperlink"/>
+                  <w:color w:val="0563C1"/>
+                  <w:u w:val="single"/>
+                </w:rPr>
+              </w:r>
+              <w:r>
+                <w:rPr>
+                  <w:rStyle w:val="Hyperlink"/>
+                  <w:rFonts w:ascii="Arial" w:hAnsi="Arial"/>
+                  <w:b w:val="0"/>
+                  <w:color w:val="0563C1"/>
+                  <w:sz w:val="19"/>
+                  <w:u w:val="single"/>
+                </w:rPr>
+                <w:t>Module 1: Brief, modifications and job planning</w:t>
+              </w:r>
+            </w:hyperlink>
           </w:p>
         </w:tc>
         <w:tc>
@@ -3109,16 +3169,26 @@
             <w:pPr>
               <w:spacing w:after="0" w:before="0"/>
             </w:pPr>
-            <w:r/>
-            <w:r>
-              <w:rPr>
-                <w:rFonts w:ascii="Arial" w:hAnsi="Arial"/>
-                <w:b/>
-                <w:color w:val="25342D"/>
-                <w:sz w:val="19"/>
-              </w:rPr>
-              <w:t>Project/folio</w:t>
-            </w:r>
+            <w:hyperlink r:id="rId19">
+              <w:r>
+                <w:rPr>
+                  <w:rStyle w:val="Hyperlink"/>
+                  <w:color w:val="0563C1"/>
+                  <w:u w:val="single"/>
+                </w:rPr>
+              </w:r>
+              <w:r>
+                <w:rPr>
+                  <w:rStyle w:val="Hyperlink"/>
+                  <w:rFonts w:ascii="Arial" w:hAnsi="Arial"/>
+                  <w:b/>
+                  <w:color w:val="0563C1"/>
+                  <w:sz w:val="19"/>
+                  <w:u w:val="single"/>
+                </w:rPr>
+                <w:t>Project/folio</w:t>
+              </w:r>
+            </w:hyperlink>
           </w:p>
         </w:tc>
         <w:tc>
@@ -3131,16 +3201,26 @@
             <w:pPr>
               <w:spacing w:after="0" w:before="0"/>
             </w:pPr>
-            <w:r/>
-            <w:r>
-              <w:rPr>
-                <w:rFonts w:ascii="Arial" w:hAnsi="Arial"/>
-                <w:b w:val="0"/>
-                <w:color w:val="25342D"/>
-                <w:sz w:val="19"/>
-              </w:rPr>
-              <w:t>Module 1: folio and project decisions</w:t>
-            </w:r>
+            <w:hyperlink r:id="rId19">
+              <w:r>
+                <w:rPr>
+                  <w:rStyle w:val="Hyperlink"/>
+                  <w:color w:val="0563C1"/>
+                  <w:u w:val="single"/>
+                </w:rPr>
+              </w:r>
+              <w:r>
+                <w:rPr>
+                  <w:rStyle w:val="Hyperlink"/>
+                  <w:rFonts w:ascii="Arial" w:hAnsi="Arial"/>
+                  <w:b w:val="0"/>
+                  <w:color w:val="0563C1"/>
+                  <w:sz w:val="19"/>
+                  <w:u w:val="single"/>
+                </w:rPr>
+                <w:t>Module 1: folio and project decisions</w:t>
+              </w:r>
+            </w:hyperlink>
           </w:p>
         </w:tc>
         <w:tc>
@@ -4049,16 +4129,26 @@
             <w:pPr>
               <w:spacing w:after="0" w:before="0"/>
             </w:pPr>
-            <w:r/>
-            <w:r>
-              <w:rPr>
-                <w:rFonts w:ascii="Arial" w:hAnsi="Arial"/>
-                <w:b/>
-                <w:color w:val="25342D"/>
-                <w:sz w:val="19"/>
-              </w:rPr>
-              <w:t>Site/theory</w:t>
-            </w:r>
+            <w:hyperlink r:id="rId23">
+              <w:r>
+                <w:rPr>
+                  <w:rStyle w:val="Hyperlink"/>
+                  <w:color w:val="0563C1"/>
+                  <w:u w:val="single"/>
+                </w:rPr>
+              </w:r>
+              <w:r>
+                <w:rPr>
+                  <w:rStyle w:val="Hyperlink"/>
+                  <w:rFonts w:ascii="Arial" w:hAnsi="Arial"/>
+                  <w:b/>
+                  <w:color w:val="0563C1"/>
+                  <w:sz w:val="19"/>
+                  <w:u w:val="single"/>
+                </w:rPr>
+                <w:t>Site/theory</w:t>
+              </w:r>
+            </w:hyperlink>
           </w:p>
         </w:tc>
         <w:tc>
@@ -4071,16 +4161,26 @@
             <w:pPr>
               <w:spacing w:after="0" w:before="0"/>
             </w:pPr>
-            <w:r/>
-            <w:r>
-              <w:rPr>
-                <w:rFonts w:ascii="Arial" w:hAnsi="Arial"/>
-                <w:b w:val="0"/>
-                <w:color w:val="25342D"/>
-                <w:sz w:val="19"/>
-              </w:rPr>
-              <w:t>Module 2: Risk, WMS and time/action planning</w:t>
-            </w:r>
+            <w:hyperlink r:id="rId23">
+              <w:r>
+                <w:rPr>
+                  <w:rStyle w:val="Hyperlink"/>
+                  <w:color w:val="0563C1"/>
+                  <w:u w:val="single"/>
+                </w:rPr>
+              </w:r>
+              <w:r>
+                <w:rPr>
+                  <w:rStyle w:val="Hyperlink"/>
+                  <w:rFonts w:ascii="Arial" w:hAnsi="Arial"/>
+                  <w:b w:val="0"/>
+                  <w:color w:val="0563C1"/>
+                  <w:sz w:val="19"/>
+                  <w:u w:val="single"/>
+                </w:rPr>
+                <w:t>Module 2: Risk, WMS and time/action planning</w:t>
+              </w:r>
+            </w:hyperlink>
           </w:p>
         </w:tc>
         <w:tc>
@@ -4307,16 +4407,26 @@
             <w:pPr>
               <w:spacing w:after="0" w:before="0"/>
             </w:pPr>
-            <w:r/>
-            <w:r>
-              <w:rPr>
-                <w:rFonts w:ascii="Arial" w:hAnsi="Arial"/>
-                <w:b/>
-                <w:color w:val="25342D"/>
-                <w:sz w:val="19"/>
-              </w:rPr>
-              <w:t>Project/folio</w:t>
-            </w:r>
+            <w:hyperlink r:id="rId19">
+              <w:r>
+                <w:rPr>
+                  <w:rStyle w:val="Hyperlink"/>
+                  <w:color w:val="0563C1"/>
+                  <w:u w:val="single"/>
+                </w:rPr>
+              </w:r>
+              <w:r>
+                <w:rPr>
+                  <w:rStyle w:val="Hyperlink"/>
+                  <w:rFonts w:ascii="Arial" w:hAnsi="Arial"/>
+                  <w:b/>
+                  <w:color w:val="0563C1"/>
+                  <w:sz w:val="19"/>
+                  <w:u w:val="single"/>
+                </w:rPr>
+                <w:t>Project/folio</w:t>
+              </w:r>
+            </w:hyperlink>
           </w:p>
         </w:tc>
         <w:tc>
@@ -4329,16 +4439,26 @@
             <w:pPr>
               <w:spacing w:after="0" w:before="0"/>
             </w:pPr>
-            <w:r/>
-            <w:r>
-              <w:rPr>
-                <w:rFonts w:ascii="Arial" w:hAnsi="Arial"/>
-                <w:b w:val="0"/>
-                <w:color w:val="25342D"/>
-                <w:sz w:val="19"/>
-              </w:rPr>
-              <w:t>Module 2: folio and project decisions</w:t>
-            </w:r>
+            <w:hyperlink r:id="rId19">
+              <w:r>
+                <w:rPr>
+                  <w:rStyle w:val="Hyperlink"/>
+                  <w:color w:val="0563C1"/>
+                  <w:u w:val="single"/>
+                </w:rPr>
+              </w:r>
+              <w:r>
+                <w:rPr>
+                  <w:rStyle w:val="Hyperlink"/>
+                  <w:rFonts w:ascii="Arial" w:hAnsi="Arial"/>
+                  <w:b w:val="0"/>
+                  <w:color w:val="0563C1"/>
+                  <w:sz w:val="19"/>
+                  <w:u w:val="single"/>
+                </w:rPr>
+                <w:t>Module 2: folio and project decisions</w:t>
+              </w:r>
+            </w:hyperlink>
           </w:p>
         </w:tc>
         <w:tc>
@@ -5247,16 +5367,26 @@
             <w:pPr>
               <w:spacing w:after="0" w:before="0"/>
             </w:pPr>
-            <w:r/>
-            <w:r>
-              <w:rPr>
-                <w:rFonts w:ascii="Arial" w:hAnsi="Arial"/>
-                <w:b/>
-                <w:color w:val="25342D"/>
-                <w:sz w:val="19"/>
-              </w:rPr>
-              <w:t>Site/theory</w:t>
-            </w:r>
+            <w:hyperlink r:id="rId26">
+              <w:r>
+                <w:rPr>
+                  <w:rStyle w:val="Hyperlink"/>
+                  <w:color w:val="0563C1"/>
+                  <w:u w:val="single"/>
+                </w:rPr>
+              </w:r>
+              <w:r>
+                <w:rPr>
+                  <w:rStyle w:val="Hyperlink"/>
+                  <w:rFonts w:ascii="Arial" w:hAnsi="Arial"/>
+                  <w:b/>
+                  <w:color w:val="0563C1"/>
+                  <w:sz w:val="19"/>
+                  <w:u w:val="single"/>
+                </w:rPr>
+                <w:t>Site/theory</w:t>
+              </w:r>
+            </w:hyperlink>
           </w:p>
         </w:tc>
         <w:tc>
@@ -5269,16 +5399,26 @@
             <w:pPr>
               <w:spacing w:after="0" w:before="0"/>
             </w:pPr>
-            <w:r/>
-            <w:r>
-              <w:rPr>
-                <w:rFonts w:ascii="Arial" w:hAnsi="Arial"/>
-                <w:b w:val="0"/>
-                <w:color w:val="25342D"/>
-                <w:sz w:val="19"/>
-              </w:rPr>
-              <w:t>Module 2: Risk, WMS and time/action planning</w:t>
-            </w:r>
+            <w:hyperlink r:id="rId26">
+              <w:r>
+                <w:rPr>
+                  <w:rStyle w:val="Hyperlink"/>
+                  <w:color w:val="0563C1"/>
+                  <w:u w:val="single"/>
+                </w:rPr>
+              </w:r>
+              <w:r>
+                <w:rPr>
+                  <w:rStyle w:val="Hyperlink"/>
+                  <w:rFonts w:ascii="Arial" w:hAnsi="Arial"/>
+                  <w:b w:val="0"/>
+                  <w:color w:val="0563C1"/>
+                  <w:sz w:val="19"/>
+                  <w:u w:val="single"/>
+                </w:rPr>
+                <w:t>Module 2: Risk, WMS and time/action planning</w:t>
+              </w:r>
+            </w:hyperlink>
           </w:p>
         </w:tc>
         <w:tc>
@@ -5489,16 +5629,26 @@
             <w:pPr>
               <w:spacing w:after="0" w:before="0"/>
             </w:pPr>
-            <w:r/>
-            <w:r>
-              <w:rPr>
-                <w:rFonts w:ascii="Arial" w:hAnsi="Arial"/>
-                <w:b/>
-                <w:color w:val="25342D"/>
-                <w:sz w:val="19"/>
-              </w:rPr>
-              <w:t>Project/folio</w:t>
-            </w:r>
+            <w:hyperlink r:id="rId19">
+              <w:r>
+                <w:rPr>
+                  <w:rStyle w:val="Hyperlink"/>
+                  <w:color w:val="0563C1"/>
+                  <w:u w:val="single"/>
+                </w:rPr>
+              </w:r>
+              <w:r>
+                <w:rPr>
+                  <w:rStyle w:val="Hyperlink"/>
+                  <w:rFonts w:ascii="Arial" w:hAnsi="Arial"/>
+                  <w:b/>
+                  <w:color w:val="0563C1"/>
+                  <w:sz w:val="19"/>
+                  <w:u w:val="single"/>
+                </w:rPr>
+                <w:t>Project/folio</w:t>
+              </w:r>
+            </w:hyperlink>
           </w:p>
         </w:tc>
         <w:tc>
@@ -5511,16 +5661,26 @@
             <w:pPr>
               <w:spacing w:after="0" w:before="0"/>
             </w:pPr>
-            <w:r/>
-            <w:r>
-              <w:rPr>
-                <w:rFonts w:ascii="Arial" w:hAnsi="Arial"/>
-                <w:b w:val="0"/>
-                <w:color w:val="25342D"/>
-                <w:sz w:val="19"/>
-              </w:rPr>
-              <w:t>Module 2: folio and project decisions</w:t>
-            </w:r>
+            <w:hyperlink r:id="rId19">
+              <w:r>
+                <w:rPr>
+                  <w:rStyle w:val="Hyperlink"/>
+                  <w:color w:val="0563C1"/>
+                  <w:u w:val="single"/>
+                </w:rPr>
+              </w:r>
+              <w:r>
+                <w:rPr>
+                  <w:rStyle w:val="Hyperlink"/>
+                  <w:rFonts w:ascii="Arial" w:hAnsi="Arial"/>
+                  <w:b w:val="0"/>
+                  <w:color w:val="0563C1"/>
+                  <w:sz w:val="19"/>
+                  <w:u w:val="single"/>
+                </w:rPr>
+                <w:t>Module 2: folio and project decisions</w:t>
+              </w:r>
+            </w:hyperlink>
           </w:p>
         </w:tc>
         <w:tc>
@@ -6429,16 +6589,26 @@
             <w:pPr>
               <w:spacing w:after="0" w:before="0"/>
             </w:pPr>
-            <w:r/>
-            <w:r>
-              <w:rPr>
-                <w:rFonts w:ascii="Arial" w:hAnsi="Arial"/>
-                <w:b/>
-                <w:color w:val="25342D"/>
-                <w:sz w:val="19"/>
-              </w:rPr>
-              <w:t>Site/theory</w:t>
-            </w:r>
+            <w:hyperlink r:id="rId28">
+              <w:r>
+                <w:rPr>
+                  <w:rStyle w:val="Hyperlink"/>
+                  <w:color w:val="0563C1"/>
+                  <w:u w:val="single"/>
+                </w:rPr>
+              </w:r>
+              <w:r>
+                <w:rPr>
+                  <w:rStyle w:val="Hyperlink"/>
+                  <w:rFonts w:ascii="Arial" w:hAnsi="Arial"/>
+                  <w:b/>
+                  <w:color w:val="0563C1"/>
+                  <w:sz w:val="19"/>
+                  <w:u w:val="single"/>
+                </w:rPr>
+                <w:t>Site/theory</w:t>
+              </w:r>
+            </w:hyperlink>
           </w:p>
         </w:tc>
         <w:tc>
@@ -6451,16 +6621,26 @@
             <w:pPr>
               <w:spacing w:after="0" w:before="0"/>
             </w:pPr>
-            <w:r/>
-            <w:r>
-              <w:rPr>
-                <w:rFonts w:ascii="Arial" w:hAnsi="Arial"/>
-                <w:b w:val="0"/>
-                <w:color w:val="25342D"/>
-                <w:sz w:val="19"/>
-              </w:rPr>
-              <w:t>Module 3: Alloys and shovel-head production</w:t>
-            </w:r>
+            <w:hyperlink r:id="rId28">
+              <w:r>
+                <w:rPr>
+                  <w:rStyle w:val="Hyperlink"/>
+                  <w:color w:val="0563C1"/>
+                  <w:u w:val="single"/>
+                </w:rPr>
+              </w:r>
+              <w:r>
+                <w:rPr>
+                  <w:rStyle w:val="Hyperlink"/>
+                  <w:rFonts w:ascii="Arial" w:hAnsi="Arial"/>
+                  <w:b w:val="0"/>
+                  <w:color w:val="0563C1"/>
+                  <w:sz w:val="19"/>
+                  <w:u w:val="single"/>
+                </w:rPr>
+                <w:t>Module 3: Alloys and shovel-head production</w:t>
+              </w:r>
+            </w:hyperlink>
           </w:p>
         </w:tc>
         <w:tc>
@@ -6687,16 +6867,26 @@
             <w:pPr>
               <w:spacing w:after="0" w:before="0"/>
             </w:pPr>
-            <w:r/>
-            <w:r>
-              <w:rPr>
-                <w:rFonts w:ascii="Arial" w:hAnsi="Arial"/>
-                <w:b/>
-                <w:color w:val="25342D"/>
-                <w:sz w:val="19"/>
-              </w:rPr>
-              <w:t>Project/folio</w:t>
-            </w:r>
+            <w:hyperlink r:id="rId19">
+              <w:r>
+                <w:rPr>
+                  <w:rStyle w:val="Hyperlink"/>
+                  <w:color w:val="0563C1"/>
+                  <w:u w:val="single"/>
+                </w:rPr>
+              </w:r>
+              <w:r>
+                <w:rPr>
+                  <w:rStyle w:val="Hyperlink"/>
+                  <w:rFonts w:ascii="Arial" w:hAnsi="Arial"/>
+                  <w:b/>
+                  <w:color w:val="0563C1"/>
+                  <w:sz w:val="19"/>
+                  <w:u w:val="single"/>
+                </w:rPr>
+                <w:t>Project/folio</w:t>
+              </w:r>
+            </w:hyperlink>
           </w:p>
         </w:tc>
         <w:tc>
@@ -6709,16 +6899,26 @@
             <w:pPr>
               <w:spacing w:after="0" w:before="0"/>
             </w:pPr>
-            <w:r/>
-            <w:r>
-              <w:rPr>
-                <w:rFonts w:ascii="Arial" w:hAnsi="Arial"/>
-                <w:b w:val="0"/>
-                <w:color w:val="25342D"/>
-                <w:sz w:val="19"/>
-              </w:rPr>
-              <w:t>Module 3: folio and project decisions</w:t>
-            </w:r>
+            <w:hyperlink r:id="rId19">
+              <w:r>
+                <w:rPr>
+                  <w:rStyle w:val="Hyperlink"/>
+                  <w:color w:val="0563C1"/>
+                  <w:u w:val="single"/>
+                </w:rPr>
+              </w:r>
+              <w:r>
+                <w:rPr>
+                  <w:rStyle w:val="Hyperlink"/>
+                  <w:rFonts w:ascii="Arial" w:hAnsi="Arial"/>
+                  <w:b w:val="0"/>
+                  <w:color w:val="0563C1"/>
+                  <w:sz w:val="19"/>
+                  <w:u w:val="single"/>
+                </w:rPr>
+                <w:t>Module 3: folio and project decisions</w:t>
+              </w:r>
+            </w:hyperlink>
           </w:p>
         </w:tc>
         <w:tc>
@@ -7583,16 +7783,26 @@
             <w:pPr>
               <w:spacing w:after="0" w:before="0"/>
             </w:pPr>
-            <w:r/>
-            <w:r>
-              <w:rPr>
-                <w:rFonts w:ascii="Arial" w:hAnsi="Arial"/>
-                <w:b/>
-                <w:color w:val="25342D"/>
-                <w:sz w:val="19"/>
-              </w:rPr>
-              <w:t>Site/theory</w:t>
-            </w:r>
+            <w:hyperlink r:id="rId31">
+              <w:r>
+                <w:rPr>
+                  <w:rStyle w:val="Hyperlink"/>
+                  <w:color w:val="0563C1"/>
+                  <w:u w:val="single"/>
+                </w:rPr>
+              </w:r>
+              <w:r>
+                <w:rPr>
+                  <w:rStyle w:val="Hyperlink"/>
+                  <w:rFonts w:ascii="Arial" w:hAnsi="Arial"/>
+                  <w:b/>
+                  <w:color w:val="0563C1"/>
+                  <w:sz w:val="19"/>
+                  <w:u w:val="single"/>
+                </w:rPr>
+                <w:t>Site/theory</w:t>
+              </w:r>
+            </w:hyperlink>
           </w:p>
         </w:tc>
         <w:tc>
@@ -7605,16 +7815,26 @@
             <w:pPr>
               <w:spacing w:after="0" w:before="0"/>
             </w:pPr>
-            <w:r/>
-            <w:r>
-              <w:rPr>
-                <w:rFonts w:ascii="Arial" w:hAnsi="Arial"/>
-                <w:b w:val="0"/>
-                <w:color w:val="25342D"/>
-                <w:sz w:val="19"/>
-              </w:rPr>
-              <w:t>Module 3: Alloys and shovel-head production</w:t>
-            </w:r>
+            <w:hyperlink r:id="rId31">
+              <w:r>
+                <w:rPr>
+                  <w:rStyle w:val="Hyperlink"/>
+                  <w:color w:val="0563C1"/>
+                  <w:u w:val="single"/>
+                </w:rPr>
+              </w:r>
+              <w:r>
+                <w:rPr>
+                  <w:rStyle w:val="Hyperlink"/>
+                  <w:rFonts w:ascii="Arial" w:hAnsi="Arial"/>
+                  <w:b w:val="0"/>
+                  <w:color w:val="0563C1"/>
+                  <w:sz w:val="19"/>
+                  <w:u w:val="single"/>
+                </w:rPr>
+                <w:t>Module 3: Alloys and shovel-head production</w:t>
+              </w:r>
+            </w:hyperlink>
           </w:p>
         </w:tc>
         <w:tc>
@@ -7825,16 +8045,26 @@
             <w:pPr>
               <w:spacing w:after="0" w:before="0"/>
             </w:pPr>
-            <w:r/>
-            <w:r>
-              <w:rPr>
-                <w:rFonts w:ascii="Arial" w:hAnsi="Arial"/>
-                <w:b/>
-                <w:color w:val="25342D"/>
-                <w:sz w:val="19"/>
-              </w:rPr>
-              <w:t>Project/folio</w:t>
-            </w:r>
+            <w:hyperlink r:id="rId19">
+              <w:r>
+                <w:rPr>
+                  <w:rStyle w:val="Hyperlink"/>
+                  <w:color w:val="0563C1"/>
+                  <w:u w:val="single"/>
+                </w:rPr>
+              </w:r>
+              <w:r>
+                <w:rPr>
+                  <w:rStyle w:val="Hyperlink"/>
+                  <w:rFonts w:ascii="Arial" w:hAnsi="Arial"/>
+                  <w:b/>
+                  <w:color w:val="0563C1"/>
+                  <w:sz w:val="19"/>
+                  <w:u w:val="single"/>
+                </w:rPr>
+                <w:t>Project/folio</w:t>
+              </w:r>
+            </w:hyperlink>
           </w:p>
         </w:tc>
         <w:tc>
@@ -7847,16 +8077,26 @@
             <w:pPr>
               <w:spacing w:after="0" w:before="0"/>
             </w:pPr>
-            <w:r/>
-            <w:r>
-              <w:rPr>
-                <w:rFonts w:ascii="Arial" w:hAnsi="Arial"/>
-                <w:b w:val="0"/>
-                <w:color w:val="25342D"/>
-                <w:sz w:val="19"/>
-              </w:rPr>
-              <w:t>Module 3: folio and project decisions</w:t>
-            </w:r>
+            <w:hyperlink r:id="rId19">
+              <w:r>
+                <w:rPr>
+                  <w:rStyle w:val="Hyperlink"/>
+                  <w:color w:val="0563C1"/>
+                  <w:u w:val="single"/>
+                </w:rPr>
+              </w:r>
+              <w:r>
+                <w:rPr>
+                  <w:rStyle w:val="Hyperlink"/>
+                  <w:rFonts w:ascii="Arial" w:hAnsi="Arial"/>
+                  <w:b w:val="0"/>
+                  <w:color w:val="0563C1"/>
+                  <w:sz w:val="19"/>
+                  <w:u w:val="single"/>
+                </w:rPr>
+                <w:t>Module 3: folio and project decisions</w:t>
+              </w:r>
+            </w:hyperlink>
           </w:p>
         </w:tc>
         <w:tc>
@@ -8721,16 +8961,26 @@
             <w:pPr>
               <w:spacing w:after="0" w:before="0"/>
             </w:pPr>
-            <w:r/>
-            <w:r>
-              <w:rPr>
-                <w:rFonts w:ascii="Arial" w:hAnsi="Arial"/>
-                <w:b/>
-                <w:color w:val="25342D"/>
-                <w:sz w:val="19"/>
-              </w:rPr>
-              <w:t>Site/theory</w:t>
-            </w:r>
+            <w:hyperlink r:id="rId33">
+              <w:r>
+                <w:rPr>
+                  <w:rStyle w:val="Hyperlink"/>
+                  <w:color w:val="0563C1"/>
+                  <w:u w:val="single"/>
+                </w:rPr>
+              </w:r>
+              <w:r>
+                <w:rPr>
+                  <w:rStyle w:val="Hyperlink"/>
+                  <w:rFonts w:ascii="Arial" w:hAnsi="Arial"/>
+                  <w:b/>
+                  <w:color w:val="0563C1"/>
+                  <w:sz w:val="19"/>
+                  <w:u w:val="single"/>
+                </w:rPr>
+                <w:t>Site/theory</w:t>
+              </w:r>
+            </w:hyperlink>
           </w:p>
         </w:tc>
         <w:tc>
@@ -8743,16 +8993,26 @@
             <w:pPr>
               <w:spacing w:after="0" w:before="0"/>
             </w:pPr>
-            <w:r/>
-            <w:r>
-              <w:rPr>
-                <w:rFonts w:ascii="Arial" w:hAnsi="Arial"/>
-                <w:b w:val="0"/>
-                <w:color w:val="25342D"/>
-                <w:sz w:val="19"/>
-              </w:rPr>
-              <w:t>Module 4: Fits, threads and machining</w:t>
-            </w:r>
+            <w:hyperlink r:id="rId33">
+              <w:r>
+                <w:rPr>
+                  <w:rStyle w:val="Hyperlink"/>
+                  <w:color w:val="0563C1"/>
+                  <w:u w:val="single"/>
+                </w:rPr>
+              </w:r>
+              <w:r>
+                <w:rPr>
+                  <w:rStyle w:val="Hyperlink"/>
+                  <w:rFonts w:ascii="Arial" w:hAnsi="Arial"/>
+                  <w:b w:val="0"/>
+                  <w:color w:val="0563C1"/>
+                  <w:sz w:val="19"/>
+                  <w:u w:val="single"/>
+                </w:rPr>
+                <w:t>Module 4: Fits, threads and machining</w:t>
+              </w:r>
+            </w:hyperlink>
           </w:p>
         </w:tc>
         <w:tc>
@@ -8995,16 +9255,26 @@
             <w:pPr>
               <w:spacing w:after="0" w:before="0"/>
             </w:pPr>
-            <w:r/>
-            <w:r>
-              <w:rPr>
-                <w:rFonts w:ascii="Arial" w:hAnsi="Arial"/>
-                <w:b/>
-                <w:color w:val="25342D"/>
-                <w:sz w:val="19"/>
-              </w:rPr>
-              <w:t>Project/folio</w:t>
-            </w:r>
+            <w:hyperlink r:id="rId19">
+              <w:r>
+                <w:rPr>
+                  <w:rStyle w:val="Hyperlink"/>
+                  <w:color w:val="0563C1"/>
+                  <w:u w:val="single"/>
+                </w:rPr>
+              </w:r>
+              <w:r>
+                <w:rPr>
+                  <w:rStyle w:val="Hyperlink"/>
+                  <w:rFonts w:ascii="Arial" w:hAnsi="Arial"/>
+                  <w:b/>
+                  <w:color w:val="0563C1"/>
+                  <w:sz w:val="19"/>
+                  <w:u w:val="single"/>
+                </w:rPr>
+                <w:t>Project/folio</w:t>
+              </w:r>
+            </w:hyperlink>
           </w:p>
         </w:tc>
         <w:tc>
@@ -9017,16 +9287,26 @@
             <w:pPr>
               <w:spacing w:after="0" w:before="0"/>
             </w:pPr>
-            <w:r/>
-            <w:r>
-              <w:rPr>
-                <w:rFonts w:ascii="Arial" w:hAnsi="Arial"/>
-                <w:b w:val="0"/>
-                <w:color w:val="25342D"/>
-                <w:sz w:val="19"/>
-              </w:rPr>
-              <w:t>Module 4: folio and project decisions</w:t>
-            </w:r>
+            <w:hyperlink r:id="rId19">
+              <w:r>
+                <w:rPr>
+                  <w:rStyle w:val="Hyperlink"/>
+                  <w:color w:val="0563C1"/>
+                  <w:u w:val="single"/>
+                </w:rPr>
+              </w:r>
+              <w:r>
+                <w:rPr>
+                  <w:rStyle w:val="Hyperlink"/>
+                  <w:rFonts w:ascii="Arial" w:hAnsi="Arial"/>
+                  <w:b w:val="0"/>
+                  <w:color w:val="0563C1"/>
+                  <w:sz w:val="19"/>
+                  <w:u w:val="single"/>
+                </w:rPr>
+                <w:t>Module 4: folio and project decisions</w:t>
+              </w:r>
+            </w:hyperlink>
           </w:p>
         </w:tc>
         <w:tc>
@@ -9991,16 +10271,26 @@
             <w:pPr>
               <w:spacing w:after="0" w:before="0"/>
             </w:pPr>
-            <w:r/>
-            <w:r>
-              <w:rPr>
-                <w:rFonts w:ascii="Arial" w:hAnsi="Arial"/>
-                <w:b/>
-                <w:color w:val="25342D"/>
-                <w:sz w:val="19"/>
-              </w:rPr>
-              <w:t>Site/theory</w:t>
-            </w:r>
+            <w:hyperlink r:id="rId38">
+              <w:r>
+                <w:rPr>
+                  <w:rStyle w:val="Hyperlink"/>
+                  <w:color w:val="0563C1"/>
+                  <w:u w:val="single"/>
+                </w:rPr>
+              </w:r>
+              <w:r>
+                <w:rPr>
+                  <w:rStyle w:val="Hyperlink"/>
+                  <w:rFonts w:ascii="Arial" w:hAnsi="Arial"/>
+                  <w:b/>
+                  <w:color w:val="0563C1"/>
+                  <w:sz w:val="19"/>
+                  <w:u w:val="single"/>
+                </w:rPr>
+                <w:t>Site/theory</w:t>
+              </w:r>
+            </w:hyperlink>
           </w:p>
         </w:tc>
         <w:tc>
@@ -10013,16 +10303,26 @@
             <w:pPr>
               <w:spacing w:after="0" w:before="0"/>
             </w:pPr>
-            <w:r/>
-            <w:r>
-              <w:rPr>
-                <w:rFonts w:ascii="Arial" w:hAnsi="Arial"/>
-                <w:b w:val="0"/>
-                <w:color w:val="25342D"/>
-                <w:sz w:val="19"/>
-              </w:rPr>
-              <w:t>Module 5: Pivot, RPM, assembly and evaluation</w:t>
-            </w:r>
+            <w:hyperlink r:id="rId38">
+              <w:r>
+                <w:rPr>
+                  <w:rStyle w:val="Hyperlink"/>
+                  <w:color w:val="0563C1"/>
+                  <w:u w:val="single"/>
+                </w:rPr>
+              </w:r>
+              <w:r>
+                <w:rPr>
+                  <w:rStyle w:val="Hyperlink"/>
+                  <w:rFonts w:ascii="Arial" w:hAnsi="Arial"/>
+                  <w:b w:val="0"/>
+                  <w:color w:val="0563C1"/>
+                  <w:sz w:val="19"/>
+                  <w:u w:val="single"/>
+                </w:rPr>
+                <w:t>Module 5: Pivot, RPM, assembly and evaluation</w:t>
+              </w:r>
+            </w:hyperlink>
           </w:p>
         </w:tc>
         <w:tc>
@@ -10265,16 +10565,26 @@
             <w:pPr>
               <w:spacing w:after="0" w:before="0"/>
             </w:pPr>
-            <w:r/>
-            <w:r>
-              <w:rPr>
-                <w:rFonts w:ascii="Arial" w:hAnsi="Arial"/>
-                <w:b/>
-                <w:color w:val="25342D"/>
-                <w:sz w:val="19"/>
-              </w:rPr>
-              <w:t>Project/folio</w:t>
-            </w:r>
+            <w:hyperlink r:id="rId19">
+              <w:r>
+                <w:rPr>
+                  <w:rStyle w:val="Hyperlink"/>
+                  <w:color w:val="0563C1"/>
+                  <w:u w:val="single"/>
+                </w:rPr>
+              </w:r>
+              <w:r>
+                <w:rPr>
+                  <w:rStyle w:val="Hyperlink"/>
+                  <w:rFonts w:ascii="Arial" w:hAnsi="Arial"/>
+                  <w:b/>
+                  <w:color w:val="0563C1"/>
+                  <w:sz w:val="19"/>
+                  <w:u w:val="single"/>
+                </w:rPr>
+                <w:t>Project/folio</w:t>
+              </w:r>
+            </w:hyperlink>
           </w:p>
         </w:tc>
         <w:tc>
@@ -10287,16 +10597,26 @@
             <w:pPr>
               <w:spacing w:after="0" w:before="0"/>
             </w:pPr>
-            <w:r/>
-            <w:r>
-              <w:rPr>
-                <w:rFonts w:ascii="Arial" w:hAnsi="Arial"/>
-                <w:b w:val="0"/>
-                <w:color w:val="25342D"/>
-                <w:sz w:val="19"/>
-              </w:rPr>
-              <w:t>Module 5: folio and project decisions</w:t>
-            </w:r>
+            <w:hyperlink r:id="rId19">
+              <w:r>
+                <w:rPr>
+                  <w:rStyle w:val="Hyperlink"/>
+                  <w:color w:val="0563C1"/>
+                  <w:u w:val="single"/>
+                </w:rPr>
+              </w:r>
+              <w:r>
+                <w:rPr>
+                  <w:rStyle w:val="Hyperlink"/>
+                  <w:rFonts w:ascii="Arial" w:hAnsi="Arial"/>
+                  <w:b w:val="0"/>
+                  <w:color w:val="0563C1"/>
+                  <w:sz w:val="19"/>
+                  <w:u w:val="single"/>
+                </w:rPr>
+                <w:t>Module 5: folio and project decisions</w:t>
+              </w:r>
+            </w:hyperlink>
           </w:p>
         </w:tc>
         <w:tc>

</xml_diff>